<commit_message>
Finished 'issuefee' merge function.
</commit_message>
<xml_diff>
--- a/project/documents/communications/issuefeexmit.docx
+++ b/project/documents/communications/issuefeexmit.docx
@@ -1,6 +1,6 @@
 
 <file path=word/document.xml><?xml version="1.0" encoding="utf-8"?>
-<w:document xmlns:wpc="http://schemas.microsoft.com/office/word/2010/wordprocessingCanvas" xmlns:cx="http://schemas.microsoft.com/office/drawing/2014/chartex" xmlns:cx1="http://schemas.microsoft.com/office/drawing/2015/9/8/chartex" xmlns:cx2="http://schemas.microsoft.com/office/drawing/2015/10/21/chartex" xmlns:cx3="http://schemas.microsoft.com/office/drawing/2016/5/9/chartex" xmlns:cx4="http://schemas.microsoft.com/office/drawing/2016/5/10/chartex" xmlns:cx5="http://schemas.microsoft.com/office/drawing/2016/5/11/chartex" xmlns:cx6="http://schemas.microsoft.com/office/drawing/2016/5/12/chartex" xmlns:cx7="http://schemas.microsoft.com/office/drawing/2016/5/13/chartex" xmlns:cx8="http://schemas.microsoft.com/office/drawing/2016/5/14/chartex" xmlns:mc="http://schemas.openxmlformats.org/markup-compatibility/2006" xmlns:aink="http://schemas.microsoft.com/office/drawing/2016/ink" xmlns:am3d="http://schemas.microsoft.com/office/drawing/2017/model3d" xmlns:o="urn:schemas-microsoft-com:office:office" xmlns:oel="http://schemas.microsoft.com/office/2019/extlst" xmlns:r="http://schemas.openxmlformats.org/officeDocument/2006/relationships" xmlns:m="http://schemas.openxmlformats.org/officeDocument/2006/math" xmlns:v="urn:schemas-microsoft-com:vml" xmlns:wp14="http://schemas.microsoft.com/office/word/2010/wordprocessingDrawing" xmlns:wp="http://schemas.openxmlformats.org/drawingml/2006/wordprocessingDrawing" xmlns:w10="urn:schemas-microsoft-com:office:word" xmlns:w="http://schemas.openxmlformats.org/wordprocessingml/2006/main" xmlns:w14="http://schemas.microsoft.com/office/word/2010/wordml" xmlns:w15="http://schemas.microsoft.com/office/word/2012/wordml" xmlns:w16cex="http://schemas.microsoft.com/office/word/2018/wordml/cex" xmlns:w16cid="http://schemas.microsoft.com/office/word/2016/wordml/cid" xmlns:w16="http://schemas.microsoft.com/office/word/2018/wordml" xmlns:w16sdtdh="http://schemas.microsoft.com/office/word/2020/wordml/sdtdatahash" xmlns:w16se="http://schemas.microsoft.com/office/word/2015/wordml/symex" xmlns:wpg="http://schemas.microsoft.com/office/word/2010/wordprocessingGroup" xmlns:wpi="http://schemas.microsoft.com/office/word/2010/wordprocessingInk" xmlns:wne="http://schemas.microsoft.com/office/word/2006/wordml" xmlns:wps="http://schemas.microsoft.com/office/word/2010/wordprocessingShape" mc:Ignorable="w14 w15 w16se w16cid w16 w16cex w16sdtdh wp14">
+<w:document xmlns:wpc="http://schemas.microsoft.com/office/word/2010/wordprocessingCanvas" xmlns:cx="http://schemas.microsoft.com/office/drawing/2014/chartex" xmlns:cx1="http://schemas.microsoft.com/office/drawing/2015/9/8/chartex" xmlns:cx2="http://schemas.microsoft.com/office/drawing/2015/10/21/chartex" xmlns:cx3="http://schemas.microsoft.com/office/drawing/2016/5/9/chartex" xmlns:cx4="http://schemas.microsoft.com/office/drawing/2016/5/10/chartex" xmlns:cx5="http://schemas.microsoft.com/office/drawing/2016/5/11/chartex" xmlns:cx6="http://schemas.microsoft.com/office/drawing/2016/5/12/chartex" xmlns:cx7="http://schemas.microsoft.com/office/drawing/2016/5/13/chartex" xmlns:cx8="http://schemas.microsoft.com/office/drawing/2016/5/14/chartex" xmlns:mc="http://schemas.openxmlformats.org/markup-compatibility/2006" xmlns:aink="http://schemas.microsoft.com/office/drawing/2016/ink" xmlns:am3d="http://schemas.microsoft.com/office/drawing/2017/model3d" xmlns:o="urn:schemas-microsoft-com:office:office" xmlns:oel="http://schemas.microsoft.com/office/2019/extlst" xmlns:r="http://schemas.openxmlformats.org/officeDocument/2006/relationships" xmlns:m="http://schemas.openxmlformats.org/officeDocument/2006/math" xmlns:v="urn:schemas-microsoft-com:vml" xmlns:wp14="http://schemas.microsoft.com/office/word/2010/wordprocessingDrawing" xmlns:wp="http://schemas.openxmlformats.org/drawingml/2006/wordprocessingDrawing" xmlns:w10="urn:schemas-microsoft-com:office:word" xmlns:w="http://schemas.openxmlformats.org/wordprocessingml/2006/main" xmlns:w14="http://schemas.microsoft.com/office/word/2010/wordml" xmlns:w15="http://schemas.microsoft.com/office/word/2012/wordml" xmlns:w16cex="http://schemas.microsoft.com/office/word/2018/wordml/cex" xmlns:w16cid="http://schemas.microsoft.com/office/word/2016/wordml/cid" xmlns:w16="http://schemas.microsoft.com/office/word/2018/wordml" xmlns:w16du="http://schemas.microsoft.com/office/word/2023/wordml/word16du" xmlns:w16sdtdh="http://schemas.microsoft.com/office/word/2020/wordml/sdtdatahash" xmlns:w16sdtfl="http://schemas.microsoft.com/office/word/2024/wordml/sdtformatlock" xmlns:w16se="http://schemas.microsoft.com/office/word/2015/wordml/symex" xmlns:wpg="http://schemas.microsoft.com/office/word/2010/wordprocessingGroup" xmlns:wpi="http://schemas.microsoft.com/office/word/2010/wordprocessingInk" xmlns:wne="http://schemas.microsoft.com/office/word/2006/wordml" xmlns:wps="http://schemas.microsoft.com/office/word/2010/wordprocessingShape" mc:Ignorable="w14 w15 w16se w16cid w16 w16cex w16sdtdh w16sdtfl w16du wp14">
   <w:body>
     <w:p>
       <w:pPr>
@@ -130,7 +130,23 @@
           <w:sz w:val="24"/>
           <w:szCs w:val="24"/>
         </w:rPr>
-        <w:t>&lt;&lt;examinerName&gt;&gt;</w:t>
+        <w:t>&lt;&lt;</w:t>
+      </w:r>
+      <w:proofErr w:type="spellStart"/>
+      <w:r>
+        <w:rPr>
+          <w:sz w:val="24"/>
+          <w:szCs w:val="24"/>
+        </w:rPr>
+        <w:t>examinerName</w:t>
+      </w:r>
+      <w:proofErr w:type="spellEnd"/>
+      <w:r>
+        <w:rPr>
+          <w:sz w:val="24"/>
+          <w:szCs w:val="24"/>
+        </w:rPr>
+        <w:t>&gt;&gt;</w:t>
       </w:r>
     </w:p>
     <w:p>
@@ -180,7 +196,23 @@
           <w:sz w:val="24"/>
           <w:szCs w:val="24"/>
         </w:rPr>
-        <w:t>&lt;&lt;artUnit&gt;&gt;</w:t>
+        <w:t>&lt;&lt;</w:t>
+      </w:r>
+      <w:proofErr w:type="spellStart"/>
+      <w:r>
+        <w:rPr>
+          <w:sz w:val="24"/>
+          <w:szCs w:val="24"/>
+        </w:rPr>
+        <w:t>artUnit</w:t>
+      </w:r>
+      <w:proofErr w:type="spellEnd"/>
+      <w:r>
+        <w:rPr>
+          <w:sz w:val="24"/>
+          <w:szCs w:val="24"/>
+        </w:rPr>
+        <w:t>&gt;&gt;</w:t>
       </w:r>
     </w:p>
     <w:p>
@@ -265,6 +297,7 @@
         </w:rPr>
         <w:t>Customer No.: &lt;&lt;</w:t>
       </w:r>
+      <w:proofErr w:type="spellStart"/>
       <w:r>
         <w:rPr>
           <w:sz w:val="24"/>
@@ -272,6 +305,7 @@
         </w:rPr>
         <w:t>custNoMFee</w:t>
       </w:r>
+      <w:proofErr w:type="spellEnd"/>
       <w:r>
         <w:rPr>
           <w:sz w:val="24"/>
@@ -285,7 +319,23 @@
           <w:szCs w:val="24"/>
         </w:rPr>
         <w:tab/>
-        <w:t>Confirmation No.: &lt;&lt;confirmNo&gt;&gt;</w:t>
+        <w:t>Confirmation No.: &lt;&lt;</w:t>
+      </w:r>
+      <w:proofErr w:type="spellStart"/>
+      <w:r>
+        <w:rPr>
+          <w:sz w:val="24"/>
+          <w:szCs w:val="24"/>
+        </w:rPr>
+        <w:t>confirmNo</w:t>
+      </w:r>
+      <w:proofErr w:type="spellEnd"/>
+      <w:r>
+        <w:rPr>
+          <w:sz w:val="24"/>
+          <w:szCs w:val="24"/>
+        </w:rPr>
+        <w:t>&gt;&gt;</w:t>
       </w:r>
     </w:p>
     <w:p>
@@ -799,7 +849,23 @@
           <w:szCs w:val="24"/>
         </w:rPr>
         <w:tab/>
-        <w:t>&lt;&lt;signatureDate&gt;&gt;</w:t>
+        <w:t>&lt;&lt;</w:t>
+      </w:r>
+      <w:proofErr w:type="spellStart"/>
+      <w:r>
+        <w:rPr>
+          <w:sz w:val="24"/>
+          <w:szCs w:val="24"/>
+        </w:rPr>
+        <w:t>signatureDate</w:t>
+      </w:r>
+      <w:proofErr w:type="spellEnd"/>
+      <w:r>
+        <w:rPr>
+          <w:sz w:val="24"/>
+          <w:szCs w:val="24"/>
+        </w:rPr>
+        <w:t>&gt;&gt;</w:t>
       </w:r>
       <w:r>
         <w:rPr>
@@ -827,7 +893,23 @@
           <w:sz w:val="32"/>
           <w:szCs w:val="32"/>
         </w:rPr>
-        <w:t>&lt;&lt;echoSignature&gt;&gt;</w:t>
+        <w:t>&lt;&lt;</w:t>
+      </w:r>
+      <w:proofErr w:type="spellStart"/>
+      <w:r>
+        <w:rPr>
+          <w:sz w:val="32"/>
+          <w:szCs w:val="32"/>
+        </w:rPr>
+        <w:t>echoSignature</w:t>
+      </w:r>
+      <w:proofErr w:type="spellEnd"/>
+      <w:r>
+        <w:rPr>
+          <w:sz w:val="32"/>
+          <w:szCs w:val="32"/>
+        </w:rPr>
+        <w:t>&gt;&gt;</w:t>
       </w:r>
     </w:p>
     <w:p>
@@ -926,30 +1008,6 @@
         </w:rPr>
       </w:pPr>
       <w:r>
-        <w:rPr>
-          <w:rFonts w:cs="Dutch801 Rm BT"/>
-          <w:sz w:val="18"/>
-          <w:szCs w:val="18"/>
-        </w:rPr>
-        <w:t>&lt;&lt;nickSA&gt;&gt;</w:t>
-      </w:r>
-      <w:r>
-        <w:rPr>
-          <w:rFonts w:cs="Dutch801 Rm BT"/>
-          <w:sz w:val="18"/>
-          <w:szCs w:val="18"/>
-        </w:rPr>
-        <w:t>:CMG:</w:t>
-      </w:r>
-      <w:r>
-        <w:rPr>
-          <w:rFonts w:cs="Dutch801 Rm BT"/>
-          <w:sz w:val="18"/>
-          <w:szCs w:val="18"/>
-        </w:rPr>
-        <w:t>&lt;&lt;nickU&gt;&gt;</w:t>
-      </w:r>
-      <w:r>
         <w:tab/>
       </w:r>
       <w:r>
@@ -961,7 +1019,15 @@
         <w:t xml:space="preserve">Reg. No. </w:t>
       </w:r>
       <w:r>
-        <w:t>&lt;&lt;SARegNo&gt;&gt;</w:t>
+        <w:t>&lt;&lt;</w:t>
+      </w:r>
+      <w:proofErr w:type="spellStart"/>
+      <w:r>
+        <w:t>SARegNo</w:t>
+      </w:r>
+      <w:proofErr w:type="spellEnd"/>
+      <w:r>
+        <w:t>&gt;&gt;</w:t>
       </w:r>
     </w:p>
     <w:p>
@@ -993,7 +1059,7 @@
 </file>
 
 <file path=word/endnotes.xml><?xml version="1.0" encoding="utf-8"?>
-<w:endnotes xmlns:wpc="http://schemas.microsoft.com/office/word/2010/wordprocessingCanvas" xmlns:cx="http://schemas.microsoft.com/office/drawing/2014/chartex" xmlns:cx1="http://schemas.microsoft.com/office/drawing/2015/9/8/chartex" xmlns:cx2="http://schemas.microsoft.com/office/drawing/2015/10/21/chartex" xmlns:cx3="http://schemas.microsoft.com/office/drawing/2016/5/9/chartex" xmlns:cx4="http://schemas.microsoft.com/office/drawing/2016/5/10/chartex" xmlns:cx5="http://schemas.microsoft.com/office/drawing/2016/5/11/chartex" xmlns:cx6="http://schemas.microsoft.com/office/drawing/2016/5/12/chartex" xmlns:cx7="http://schemas.microsoft.com/office/drawing/2016/5/13/chartex" xmlns:cx8="http://schemas.microsoft.com/office/drawing/2016/5/14/chartex" xmlns:mc="http://schemas.openxmlformats.org/markup-compatibility/2006" xmlns:aink="http://schemas.microsoft.com/office/drawing/2016/ink" xmlns:am3d="http://schemas.microsoft.com/office/drawing/2017/model3d" xmlns:o="urn:schemas-microsoft-com:office:office" xmlns:oel="http://schemas.microsoft.com/office/2019/extlst" xmlns:r="http://schemas.openxmlformats.org/officeDocument/2006/relationships" xmlns:m="http://schemas.openxmlformats.org/officeDocument/2006/math" xmlns:v="urn:schemas-microsoft-com:vml" xmlns:wp14="http://schemas.microsoft.com/office/word/2010/wordprocessingDrawing" xmlns:wp="http://schemas.openxmlformats.org/drawingml/2006/wordprocessingDrawing" xmlns:w10="urn:schemas-microsoft-com:office:word" xmlns:w="http://schemas.openxmlformats.org/wordprocessingml/2006/main" xmlns:w14="http://schemas.microsoft.com/office/word/2010/wordml" xmlns:w15="http://schemas.microsoft.com/office/word/2012/wordml" xmlns:w16cex="http://schemas.microsoft.com/office/word/2018/wordml/cex" xmlns:w16cid="http://schemas.microsoft.com/office/word/2016/wordml/cid" xmlns:w16="http://schemas.microsoft.com/office/word/2018/wordml" xmlns:w16sdtdh="http://schemas.microsoft.com/office/word/2020/wordml/sdtdatahash" xmlns:w16se="http://schemas.microsoft.com/office/word/2015/wordml/symex" xmlns:wpg="http://schemas.microsoft.com/office/word/2010/wordprocessingGroup" xmlns:wpi="http://schemas.microsoft.com/office/word/2010/wordprocessingInk" xmlns:wne="http://schemas.microsoft.com/office/word/2006/wordml" xmlns:wps="http://schemas.microsoft.com/office/word/2010/wordprocessingShape" mc:Ignorable="w14 w15 w16se w16cid w16 w16cex w16sdtdh wp14">
+<w:endnotes xmlns:wpc="http://schemas.microsoft.com/office/word/2010/wordprocessingCanvas" xmlns:cx="http://schemas.microsoft.com/office/drawing/2014/chartex" xmlns:cx1="http://schemas.microsoft.com/office/drawing/2015/9/8/chartex" xmlns:cx2="http://schemas.microsoft.com/office/drawing/2015/10/21/chartex" xmlns:cx3="http://schemas.microsoft.com/office/drawing/2016/5/9/chartex" xmlns:cx4="http://schemas.microsoft.com/office/drawing/2016/5/10/chartex" xmlns:cx5="http://schemas.microsoft.com/office/drawing/2016/5/11/chartex" xmlns:cx6="http://schemas.microsoft.com/office/drawing/2016/5/12/chartex" xmlns:cx7="http://schemas.microsoft.com/office/drawing/2016/5/13/chartex" xmlns:cx8="http://schemas.microsoft.com/office/drawing/2016/5/14/chartex" xmlns:mc="http://schemas.openxmlformats.org/markup-compatibility/2006" xmlns:aink="http://schemas.microsoft.com/office/drawing/2016/ink" xmlns:am3d="http://schemas.microsoft.com/office/drawing/2017/model3d" xmlns:o="urn:schemas-microsoft-com:office:office" xmlns:oel="http://schemas.microsoft.com/office/2019/extlst" xmlns:r="http://schemas.openxmlformats.org/officeDocument/2006/relationships" xmlns:m="http://schemas.openxmlformats.org/officeDocument/2006/math" xmlns:v="urn:schemas-microsoft-com:vml" xmlns:wp14="http://schemas.microsoft.com/office/word/2010/wordprocessingDrawing" xmlns:wp="http://schemas.openxmlformats.org/drawingml/2006/wordprocessingDrawing" xmlns:w10="urn:schemas-microsoft-com:office:word" xmlns:w="http://schemas.openxmlformats.org/wordprocessingml/2006/main" xmlns:w14="http://schemas.microsoft.com/office/word/2010/wordml" xmlns:w15="http://schemas.microsoft.com/office/word/2012/wordml" xmlns:w16cex="http://schemas.microsoft.com/office/word/2018/wordml/cex" xmlns:w16cid="http://schemas.microsoft.com/office/word/2016/wordml/cid" xmlns:w16="http://schemas.microsoft.com/office/word/2018/wordml" xmlns:w16du="http://schemas.microsoft.com/office/word/2023/wordml/word16du" xmlns:w16sdtdh="http://schemas.microsoft.com/office/word/2020/wordml/sdtdatahash" xmlns:w16sdtfl="http://schemas.microsoft.com/office/word/2024/wordml/sdtformatlock" xmlns:w16se="http://schemas.microsoft.com/office/word/2015/wordml/symex" xmlns:wpg="http://schemas.microsoft.com/office/word/2010/wordprocessingGroup" xmlns:wpi="http://schemas.microsoft.com/office/word/2010/wordprocessingInk" xmlns:wne="http://schemas.microsoft.com/office/word/2006/wordml" xmlns:wps="http://schemas.microsoft.com/office/word/2010/wordprocessingShape" mc:Ignorable="w14 w15 w16se w16cid w16 w16cex w16sdtdh w16sdtfl w16du wp14">
   <w:endnote w:type="separator" w:id="-1">
     <w:p>
       <w:r>
@@ -1012,7 +1078,7 @@
 </file>
 
 <file path=word/footnotes.xml><?xml version="1.0" encoding="utf-8"?>
-<w:footnotes xmlns:wpc="http://schemas.microsoft.com/office/word/2010/wordprocessingCanvas" xmlns:cx="http://schemas.microsoft.com/office/drawing/2014/chartex" xmlns:cx1="http://schemas.microsoft.com/office/drawing/2015/9/8/chartex" xmlns:cx2="http://schemas.microsoft.com/office/drawing/2015/10/21/chartex" xmlns:cx3="http://schemas.microsoft.com/office/drawing/2016/5/9/chartex" xmlns:cx4="http://schemas.microsoft.com/office/drawing/2016/5/10/chartex" xmlns:cx5="http://schemas.microsoft.com/office/drawing/2016/5/11/chartex" xmlns:cx6="http://schemas.microsoft.com/office/drawing/2016/5/12/chartex" xmlns:cx7="http://schemas.microsoft.com/office/drawing/2016/5/13/chartex" xmlns:cx8="http://schemas.microsoft.com/office/drawing/2016/5/14/chartex" xmlns:mc="http://schemas.openxmlformats.org/markup-compatibility/2006" xmlns:aink="http://schemas.microsoft.com/office/drawing/2016/ink" xmlns:am3d="http://schemas.microsoft.com/office/drawing/2017/model3d" xmlns:o="urn:schemas-microsoft-com:office:office" xmlns:oel="http://schemas.microsoft.com/office/2019/extlst" xmlns:r="http://schemas.openxmlformats.org/officeDocument/2006/relationships" xmlns:m="http://schemas.openxmlformats.org/officeDocument/2006/math" xmlns:v="urn:schemas-microsoft-com:vml" xmlns:wp14="http://schemas.microsoft.com/office/word/2010/wordprocessingDrawing" xmlns:wp="http://schemas.openxmlformats.org/drawingml/2006/wordprocessingDrawing" xmlns:w10="urn:schemas-microsoft-com:office:word" xmlns:w="http://schemas.openxmlformats.org/wordprocessingml/2006/main" xmlns:w14="http://schemas.microsoft.com/office/word/2010/wordml" xmlns:w15="http://schemas.microsoft.com/office/word/2012/wordml" xmlns:w16cex="http://schemas.microsoft.com/office/word/2018/wordml/cex" xmlns:w16cid="http://schemas.microsoft.com/office/word/2016/wordml/cid" xmlns:w16="http://schemas.microsoft.com/office/word/2018/wordml" xmlns:w16sdtdh="http://schemas.microsoft.com/office/word/2020/wordml/sdtdatahash" xmlns:w16se="http://schemas.microsoft.com/office/word/2015/wordml/symex" xmlns:wpg="http://schemas.microsoft.com/office/word/2010/wordprocessingGroup" xmlns:wpi="http://schemas.microsoft.com/office/word/2010/wordprocessingInk" xmlns:wne="http://schemas.microsoft.com/office/word/2006/wordml" xmlns:wps="http://schemas.microsoft.com/office/word/2010/wordprocessingShape" mc:Ignorable="w14 w15 w16se w16cid w16 w16cex w16sdtdh wp14">
+<w:footnotes xmlns:wpc="http://schemas.microsoft.com/office/word/2010/wordprocessingCanvas" xmlns:cx="http://schemas.microsoft.com/office/drawing/2014/chartex" xmlns:cx1="http://schemas.microsoft.com/office/drawing/2015/9/8/chartex" xmlns:cx2="http://schemas.microsoft.com/office/drawing/2015/10/21/chartex" xmlns:cx3="http://schemas.microsoft.com/office/drawing/2016/5/9/chartex" xmlns:cx4="http://schemas.microsoft.com/office/drawing/2016/5/10/chartex" xmlns:cx5="http://schemas.microsoft.com/office/drawing/2016/5/11/chartex" xmlns:cx6="http://schemas.microsoft.com/office/drawing/2016/5/12/chartex" xmlns:cx7="http://schemas.microsoft.com/office/drawing/2016/5/13/chartex" xmlns:cx8="http://schemas.microsoft.com/office/drawing/2016/5/14/chartex" xmlns:mc="http://schemas.openxmlformats.org/markup-compatibility/2006" xmlns:aink="http://schemas.microsoft.com/office/drawing/2016/ink" xmlns:am3d="http://schemas.microsoft.com/office/drawing/2017/model3d" xmlns:o="urn:schemas-microsoft-com:office:office" xmlns:oel="http://schemas.microsoft.com/office/2019/extlst" xmlns:r="http://schemas.openxmlformats.org/officeDocument/2006/relationships" xmlns:m="http://schemas.openxmlformats.org/officeDocument/2006/math" xmlns:v="urn:schemas-microsoft-com:vml" xmlns:wp14="http://schemas.microsoft.com/office/word/2010/wordprocessingDrawing" xmlns:wp="http://schemas.openxmlformats.org/drawingml/2006/wordprocessingDrawing" xmlns:w10="urn:schemas-microsoft-com:office:word" xmlns:w="http://schemas.openxmlformats.org/wordprocessingml/2006/main" xmlns:w14="http://schemas.microsoft.com/office/word/2010/wordml" xmlns:w15="http://schemas.microsoft.com/office/word/2012/wordml" xmlns:w16cex="http://schemas.microsoft.com/office/word/2018/wordml/cex" xmlns:w16cid="http://schemas.microsoft.com/office/word/2016/wordml/cid" xmlns:w16="http://schemas.microsoft.com/office/word/2018/wordml" xmlns:w16du="http://schemas.microsoft.com/office/word/2023/wordml/word16du" xmlns:w16sdtdh="http://schemas.microsoft.com/office/word/2020/wordml/sdtdatahash" xmlns:w16sdtfl="http://schemas.microsoft.com/office/word/2024/wordml/sdtformatlock" xmlns:w16se="http://schemas.microsoft.com/office/word/2015/wordml/symex" xmlns:wpg="http://schemas.microsoft.com/office/word/2010/wordprocessingGroup" xmlns:wpi="http://schemas.microsoft.com/office/word/2010/wordprocessingInk" xmlns:wne="http://schemas.microsoft.com/office/word/2006/wordml" xmlns:wps="http://schemas.microsoft.com/office/word/2010/wordprocessingShape" mc:Ignorable="w14 w15 w16se w16cid w16 w16cex w16sdtdh w16sdtfl w16du wp14">
   <w:footnote w:type="separator" w:id="-1">
     <w:p>
       <w:r>
@@ -1031,7 +1097,7 @@
 </file>
 
 <file path=word/styles.xml><?xml version="1.0" encoding="utf-8"?>
-<w:styles xmlns:mc="http://schemas.openxmlformats.org/markup-compatibility/2006" xmlns:r="http://schemas.openxmlformats.org/officeDocument/2006/relationships" xmlns:w="http://schemas.openxmlformats.org/wordprocessingml/2006/main" xmlns:w14="http://schemas.microsoft.com/office/word/2010/wordml" xmlns:w15="http://schemas.microsoft.com/office/word/2012/wordml" xmlns:w16cex="http://schemas.microsoft.com/office/word/2018/wordml/cex" xmlns:w16cid="http://schemas.microsoft.com/office/word/2016/wordml/cid" xmlns:w16="http://schemas.microsoft.com/office/word/2018/wordml" xmlns:w16sdtdh="http://schemas.microsoft.com/office/word/2020/wordml/sdtdatahash" xmlns:w16se="http://schemas.microsoft.com/office/word/2015/wordml/symex" mc:Ignorable="w14 w15 w16se w16cid w16 w16cex w16sdtdh">
+<w:styles xmlns:mc="http://schemas.openxmlformats.org/markup-compatibility/2006" xmlns:r="http://schemas.openxmlformats.org/officeDocument/2006/relationships" xmlns:w="http://schemas.openxmlformats.org/wordprocessingml/2006/main" xmlns:w14="http://schemas.microsoft.com/office/word/2010/wordml" xmlns:w15="http://schemas.microsoft.com/office/word/2012/wordml" xmlns:w16cex="http://schemas.microsoft.com/office/word/2018/wordml/cex" xmlns:w16cid="http://schemas.microsoft.com/office/word/2016/wordml/cid" xmlns:w16="http://schemas.microsoft.com/office/word/2018/wordml" xmlns:w16du="http://schemas.microsoft.com/office/word/2023/wordml/word16du" xmlns:w16sdtdh="http://schemas.microsoft.com/office/word/2020/wordml/sdtdatahash" xmlns:w16sdtfl="http://schemas.microsoft.com/office/word/2024/wordml/sdtformatlock" xmlns:w16se="http://schemas.microsoft.com/office/word/2015/wordml/symex" mc:Ignorable="w14 w15 w16se w16cid w16 w16cex w16sdtdh w16sdtfl w16du">
   <w:docDefaults>
     <w:rPrDefault>
       <w:rPr>
@@ -1057,6 +1123,50 @@
     <w:lsdException w:name="Subtitle" w:qFormat="1"/>
     <w:lsdException w:name="Strong" w:qFormat="1"/>
     <w:lsdException w:name="Emphasis" w:qFormat="1"/>
+    <w:lsdException w:name="Normal Table" w:semiHidden="1" w:unhideWhenUsed="1"/>
+    <w:lsdException w:name="Table Simple 1" w:semiHidden="1" w:unhideWhenUsed="1"/>
+    <w:lsdException w:name="Table Simple 2" w:semiHidden="1" w:unhideWhenUsed="1"/>
+    <w:lsdException w:name="Table Simple 3" w:semiHidden="1" w:unhideWhenUsed="1"/>
+    <w:lsdException w:name="Table Classic 1" w:semiHidden="1" w:unhideWhenUsed="1"/>
+    <w:lsdException w:name="Table Classic 2" w:semiHidden="1" w:unhideWhenUsed="1"/>
+    <w:lsdException w:name="Table Classic 3" w:semiHidden="1" w:unhideWhenUsed="1"/>
+    <w:lsdException w:name="Table Classic 4" w:semiHidden="1" w:unhideWhenUsed="1"/>
+    <w:lsdException w:name="Table Colorful 1" w:semiHidden="1" w:unhideWhenUsed="1"/>
+    <w:lsdException w:name="Table Colorful 2" w:semiHidden="1" w:unhideWhenUsed="1"/>
+    <w:lsdException w:name="Table Colorful 3" w:semiHidden="1" w:unhideWhenUsed="1"/>
+    <w:lsdException w:name="Table Columns 1" w:semiHidden="1" w:unhideWhenUsed="1"/>
+    <w:lsdException w:name="Table Columns 2" w:semiHidden="1" w:unhideWhenUsed="1"/>
+    <w:lsdException w:name="Table Columns 3" w:semiHidden="1" w:unhideWhenUsed="1"/>
+    <w:lsdException w:name="Table Columns 4" w:semiHidden="1" w:unhideWhenUsed="1"/>
+    <w:lsdException w:name="Table Columns 5" w:semiHidden="1" w:unhideWhenUsed="1"/>
+    <w:lsdException w:name="Table Grid 1" w:semiHidden="1" w:unhideWhenUsed="1"/>
+    <w:lsdException w:name="Table Grid 2" w:semiHidden="1" w:unhideWhenUsed="1"/>
+    <w:lsdException w:name="Table Grid 3" w:semiHidden="1" w:unhideWhenUsed="1"/>
+    <w:lsdException w:name="Table Grid 4" w:semiHidden="1" w:unhideWhenUsed="1"/>
+    <w:lsdException w:name="Table Grid 5" w:semiHidden="1" w:unhideWhenUsed="1"/>
+    <w:lsdException w:name="Table Grid 6" w:semiHidden="1" w:unhideWhenUsed="1"/>
+    <w:lsdException w:name="Table Grid 7" w:semiHidden="1" w:unhideWhenUsed="1"/>
+    <w:lsdException w:name="Table Grid 8" w:semiHidden="1" w:unhideWhenUsed="1"/>
+    <w:lsdException w:name="Table List 1" w:semiHidden="1" w:unhideWhenUsed="1"/>
+    <w:lsdException w:name="Table List 2" w:semiHidden="1" w:unhideWhenUsed="1"/>
+    <w:lsdException w:name="Table List 3" w:semiHidden="1" w:unhideWhenUsed="1"/>
+    <w:lsdException w:name="Table List 4" w:semiHidden="1" w:unhideWhenUsed="1"/>
+    <w:lsdException w:name="Table List 5" w:semiHidden="1" w:unhideWhenUsed="1"/>
+    <w:lsdException w:name="Table List 6" w:semiHidden="1" w:unhideWhenUsed="1"/>
+    <w:lsdException w:name="Table List 7" w:semiHidden="1" w:unhideWhenUsed="1"/>
+    <w:lsdException w:name="Table List 8" w:semiHidden="1" w:unhideWhenUsed="1"/>
+    <w:lsdException w:name="Table 3D effects 1" w:semiHidden="1" w:unhideWhenUsed="1"/>
+    <w:lsdException w:name="Table 3D effects 2" w:semiHidden="1" w:unhideWhenUsed="1"/>
+    <w:lsdException w:name="Table 3D effects 3" w:semiHidden="1" w:unhideWhenUsed="1"/>
+    <w:lsdException w:name="Table Contemporary" w:semiHidden="1" w:unhideWhenUsed="1"/>
+    <w:lsdException w:name="Table Elegant" w:semiHidden="1" w:unhideWhenUsed="1"/>
+    <w:lsdException w:name="Table Professional" w:semiHidden="1" w:unhideWhenUsed="1"/>
+    <w:lsdException w:name="Table Subtle 1" w:semiHidden="1" w:unhideWhenUsed="1"/>
+    <w:lsdException w:name="Table Subtle 2" w:semiHidden="1" w:unhideWhenUsed="1"/>
+    <w:lsdException w:name="Table Web 1" w:semiHidden="1" w:unhideWhenUsed="1"/>
+    <w:lsdException w:name="Table Web 2" w:semiHidden="1" w:unhideWhenUsed="1"/>
+    <w:lsdException w:name="Table Web 3" w:semiHidden="1" w:unhideWhenUsed="1"/>
+    <w:lsdException w:name="Table Theme" w:semiHidden="1" w:unhideWhenUsed="1"/>
     <w:lsdException w:name="Placeholder Text" w:semiHidden="1" w:uiPriority="99"/>
     <w:lsdException w:name="No Spacing" w:uiPriority="1" w:qFormat="1"/>
     <w:lsdException w:name="Light Shading" w:uiPriority="60"/>
@@ -1452,11 +1562,15 @@
   </w:style>
   <w:style w:type="character" w:default="1" w:styleId="DefaultParagraphFont">
     <w:name w:val="Default Paragraph Font"/>
+    <w:uiPriority w:val="1"/>
     <w:semiHidden/>
+    <w:unhideWhenUsed/>
   </w:style>
   <w:style w:type="table" w:default="1" w:styleId="TableNormal">
     <w:name w:val="Normal Table"/>
+    <w:uiPriority w:val="99"/>
     <w:semiHidden/>
+    <w:unhideWhenUsed/>
     <w:tblPr>
       <w:tblInd w:w="0" w:type="dxa"/>
       <w:tblCellMar>
@@ -1469,7 +1583,9 @@
   </w:style>
   <w:style w:type="numbering" w:default="1" w:styleId="NoList">
     <w:name w:val="No List"/>
+    <w:uiPriority w:val="99"/>
     <w:semiHidden/>
+    <w:unhideWhenUsed/>
   </w:style>
   <w:style w:type="paragraph" w:styleId="Title">
     <w:name w:val="Title"/>

</xml_diff>